<commit_message>
Updates to Creating a Playbook article
</commit_message>
<xml_diff>
--- a/Graphium_Support_Platform_Recommendation.docx
+++ b/Graphium_Support_Platform_Recommendation.docx
@@ -632,7 +632,7 @@
                 <w:sz w:val="22"/>
                 <w:szCs w:val="22"/>
               </w:rPr>
-              <w:t xml:space="preserve">Zoho Desk or Freshdesk — both have confirmed HIPAA BAA and Customer Portal; see Platform Evaluations</w:t>
+              <w:t xml:space="preserve">Zoho Desk — confirmed HIPAA BAA, Zia AI covered under BAA, customer portal, strong feature set</w:t>
             </w:r>
           </w:p>
         </w:tc>
@@ -667,7 +667,7 @@
                 <w:sz w:val="22"/>
                 <w:szCs w:val="22"/>
               </w:rPr>
-              <w:t xml:space="preserve">Open items (3)</w:t>
+              <w:t xml:space="preserve">Open items (2)</w:t>
             </w:r>
           </w:p>
         </w:tc>
@@ -698,7 +698,7 @@
                 <w:sz w:val="22"/>
                 <w:szCs w:val="22"/>
               </w:rPr>
-              <w:t xml:space="preserve">DevRev subprocessor list · Zoho follow-up answers · Freshdesk BAA tier + Freddy AI subprocessors</w:t>
+              <w:t xml:space="preserve">DevRev AI subprocessor list · Zoho Desk follow-up (pricing + data residency)</w:t>
             </w:r>
           </w:p>
         </w:tc>
@@ -2649,7 +2649,7 @@
           <w:sz w:val="26"/>
           <w:szCs w:val="26"/>
         </w:rPr>
-        <w:t xml:space="preserve">9. Freshdesk — Strong Secondary Contender</w:t>
+        <w:t xml:space="preserve">9. Freshdesk — Not Recommended</w:t>
       </w:r>
     </w:p>
     <w:p>
@@ -2662,7 +2662,7 @@
           <w:sz w:val="22"/>
           <w:szCs w:val="22"/>
         </w:rPr>
-        <w:t xml:space="preserve">Freshdesk is a mature enterprise support platform from Freshworks with a strong feature set: Freddy AI (Self Service for autonomous resolution, Copilot for agent assist, Insights for analytics), flat-rate AI pricing with no per-resolution fees, a Customer Portal (shared with Zoho Desk as the only platforms in this evaluation to offer one), and a native Linear integration via the Freshworks Marketplace.</w:t>
+        <w:t xml:space="preserve">Freshdesk is a mature enterprise support platform from Freshworks with a strong feature set on paper: Freddy AI (Self Service for autonomous resolution, Copilot for agent assist, Insights for analytics), a Customer Portal, and a native Linear integration via the Freshworks Marketplace.</w:t>
       </w:r>
     </w:p>
     <w:p>
@@ -2688,7 +2688,7 @@
           <w:sz w:val="22"/>
           <w:szCs w:val="22"/>
         </w:rPr>
-        <w:t xml:space="preserve">HIPAA status: Confirmed. Freshworks' security team confirmed that Freshdesk is HIPAA compliant and a BAA can be executed. Two items remain open before a final commitment: (a) which pricing tier requires the BAA — the sales contact could not confirm whether it is Pro or Enterprise — and (b) whether Freddy AI subprocessors are explicitly covered under the BAA. Pending those confirmations, Freshdesk advances as a strong secondary contender alongside Zoho Desk.</w:t>
+        <w:t xml:space="preserve">HIPAA status: BAA confirmed for the core Freshdesk Enterprise platform. However, Freddy Self Service and Freddy Copilot are explicitly excluded from Freshworks' HIPAA configuration guidance and the BAA. Freshworks' direct guidance is not to enable Freddy AI features for PHI workflows. The HIPAA configuration article was last updated August 2023 and does not mention Freddy AI at all — the product post-dates the documentation. Enterprise list pricing is $168/agent/month, plus $29/seat for Freddy Copilot and $49 per 100 AI Agent bot sessions — the highest cost in this evaluation by a significant margin. Without usable AI under the BAA and at 8× the per-seat cost of DevRev, Freshdesk is not recommended.</w:t>
       </w:r>
     </w:p>
     <w:p>
@@ -2891,7 +2891,7 @@
           <w:sz w:val="26"/>
           <w:szCs w:val="26"/>
         </w:rPr>
-        <w:t xml:space="preserve">Secondary: Zoho Desk or Freshdesk</w:t>
+        <w:t xml:space="preserve">Secondary: Zoho Desk</w:t>
       </w:r>
     </w:p>
     <w:p>
@@ -2904,7 +2904,7 @@
           <w:sz w:val="22"/>
           <w:szCs w:val="22"/>
         </w:rPr>
-        <w:t xml:space="preserve">Both Zoho Desk and Freshdesk are recommended as fallback options if DevRev is disqualified — for example, if subprocessor coverage under the BAA cannot be confirmed for CX Agent and Turing AI. Both platforms now have confirmed HIPAA BAA availability.</w:t>
+        <w:t xml:space="preserve">Zoho Desk is recommended as the fallback option if DevRev is disqualified — for example, if subprocessor coverage under the BAA cannot be confirmed for CX Agent and Turing AI.</w:t>
       </w:r>
     </w:p>
     <w:p>
@@ -2918,23 +2918,6 @@
           <w:szCs w:val="22"/>
         </w:rPr>
         <w:t xml:space="preserve"/>
-      </w:r>
-    </w:p>
-    <w:p>
-      <w:pPr>
-        <w:pStyle w:val="Heading3"/>
-        <w:spacing w:after="80" w:before="160"/>
-      </w:pPr>
-      <w:r>
-        <w:rPr>
-          <w:rFonts w:ascii="Arial" w:cs="Arial" w:eastAsia="Arial" w:hAnsi="Arial"/>
-          <w:b/>
-          <w:bCs/>
-          <w:color w:val="0EA5E9"/>
-          <w:sz w:val="22"/>
-          <w:szCs w:val="22"/>
-        </w:rPr>
-        <w:t xml:space="preserve">Zoho Desk</w:t>
       </w:r>
     </w:p>
     <w:p>
@@ -3032,19 +3015,18 @@
     </w:p>
     <w:p>
       <w:pPr>
-        <w:pStyle w:val="Heading3"/>
-        <w:spacing w:after="80" w:before="160"/>
+        <w:pStyle w:val="Heading2"/>
+        <w:spacing w:after="120" w:before="240"/>
       </w:pPr>
       <w:r>
         <w:rPr>
           <w:rFonts w:ascii="Arial" w:cs="Arial" w:eastAsia="Arial" w:hAnsi="Arial"/>
           <w:b/>
           <w:bCs/>
-          <w:color w:val="0EA5E9"/>
-          <w:sz w:val="22"/>
-          <w:szCs w:val="22"/>
-        </w:rPr>
-        <w:t xml:space="preserve">Freshdesk</w:t>
+          <w:sz w:val="26"/>
+          <w:szCs w:val="26"/>
+        </w:rPr>
+        <w:t xml:space="preserve">Not Recommended at This Time</w:t>
       </w:r>
     </w:p>
     <w:p>
@@ -3062,7 +3044,7 @@
           <w:sz w:val="22"/>
           <w:szCs w:val="22"/>
         </w:rPr>
-        <w:t xml:space="preserve">HIPAA BAA confirmed — Freshworks security team confirmed compliance and BAA availability. Two items still pending: which tier requires the BAA and whether Freddy AI subprocessors are explicitly covered.</w:t>
+        <w:t xml:space="preserve">HubSpot Service Hub — Viable only if deeply embedded in the broader HubSpot CRM ecosystem. Higher per-seat cost than all alternatives, weaker AI (no autonomous resolution), and HIPAA coverage limited to specific sensitive data fields. Staying is the right call only if migration cost outweighs these gaps.</w:t>
       </w:r>
     </w:p>
     <w:p>
@@ -3080,7 +3062,7 @@
           <w:sz w:val="22"/>
           <w:szCs w:val="22"/>
         </w:rPr>
-        <w:t xml:space="preserve">Freddy Self Service — Fully autonomous resolution engine comparable to DevRev's CX Agent, with flat-rate pricing and no per-resolution fees.</w:t>
+        <w:t xml:space="preserve">Plain — Eliminated. No HIPAA BAA available at any tier.</w:t>
       </w:r>
     </w:p>
     <w:p>
@@ -3098,7 +3080,7 @@
           <w:sz w:val="22"/>
           <w:szCs w:val="22"/>
         </w:rPr>
-        <w:t xml:space="preserve">Customer Portal — One of only two platforms in this evaluation with a native customer-facing self-service portal (alongside Zoho Desk).</w:t>
+        <w:t xml:space="preserve">Chatwoot — Viable only if self-hosting is accepted as an operational model; limited AI capabilities.</w:t>
       </w:r>
     </w:p>
     <w:p>
@@ -3116,62 +3098,7 @@
           <w:sz w:val="22"/>
           <w:szCs w:val="22"/>
         </w:rPr>
-        <w:t xml:space="preserve">Native Linear integration — Available via the Freshworks Marketplace; lowest Linear integration effort of any platform outside of Linear Asks itself.</w:t>
-      </w:r>
-    </w:p>
-    <w:p>
-      <w:pPr>
-        <w:spacing w:after="80"/>
-      </w:pPr>
-      <w:r>
-        <w:rPr>
-          <w:rFonts w:ascii="Arial" w:cs="Arial" w:eastAsia="Arial" w:hAnsi="Arial"/>
-          <w:sz w:val="22"/>
-          <w:szCs w:val="22"/>
-        </w:rPr>
-        <w:t xml:space="preserve"/>
-      </w:r>
-    </w:p>
-    <w:p>
-      <w:pPr>
-        <w:spacing w:after="140" w:line="280" w:lineRule="auto"/>
-      </w:pPr>
-      <w:r>
-        <w:rPr>
-          <w:rFonts w:ascii="Arial" w:cs="Arial" w:eastAsia="Arial" w:hAnsi="Arial"/>
-          <w:sz w:val="22"/>
-          <w:szCs w:val="22"/>
-        </w:rPr>
-        <w:t xml:space="preserve">Trade-offs: BAA tier requirement and exact pricing still pending final confirmation. Once resolved, Freshdesk may prove stronger than Zoho Desk as the secondary recommendation given its autonomous AI and native Linear integration.</w:t>
-      </w:r>
-    </w:p>
-    <w:p>
-      <w:pPr>
-        <w:spacing w:after="80"/>
-      </w:pPr>
-      <w:r>
-        <w:rPr>
-          <w:rFonts w:ascii="Arial" w:cs="Arial" w:eastAsia="Arial" w:hAnsi="Arial"/>
-          <w:sz w:val="22"/>
-          <w:szCs w:val="22"/>
-        </w:rPr>
-        <w:t xml:space="preserve"/>
-      </w:r>
-    </w:p>
-    <w:p>
-      <w:pPr>
-        <w:pStyle w:val="Heading2"/>
-        <w:spacing w:after="120" w:before="240"/>
-      </w:pPr>
-      <w:r>
-        <w:rPr>
-          <w:rFonts w:ascii="Arial" w:cs="Arial" w:eastAsia="Arial" w:hAnsi="Arial"/>
-          <w:b/>
-          <w:bCs/>
-          <w:sz w:val="26"/>
-          <w:szCs w:val="26"/>
-        </w:rPr>
-        <w:t xml:space="preserve">Not Recommended at This Time</w:t>
+        <w:t xml:space="preserve">Intercom — Highest total cost of ownership; Fin AI billing risk outweighs best-in-class AI capability.</w:t>
       </w:r>
     </w:p>
     <w:p>
@@ -3189,7 +3116,7 @@
           <w:sz w:val="22"/>
           <w:szCs w:val="22"/>
         </w:rPr>
-        <w:t xml:space="preserve">HubSpot Service Hub — Viable only if deeply embedded in the broader HubSpot CRM ecosystem. Higher per-seat cost than all alternatives, weaker AI (no autonomous resolution), and HIPAA coverage limited to specific sensitive data fields. Staying is the right call only if migration cost outweighs these gaps.</w:t>
+        <w:t xml:space="preserve">Linear Asks — Not a support platform. Use as a complement to the primary platform selection.</w:t>
       </w:r>
     </w:p>
     <w:p>
@@ -3207,61 +3134,7 @@
           <w:sz w:val="22"/>
           <w:szCs w:val="22"/>
         </w:rPr>
-        <w:t xml:space="preserve">Plain — Eliminated. No HIPAA BAA available at any tier.</w:t>
-      </w:r>
-    </w:p>
-    <w:p>
-      <w:pPr>
-        <w:pStyle w:val="ListParagraph"/>
-        <w:numPr>
-          <w:ilvl w:val="0"/>
-          <w:numId w:val="2"/>
-        </w:numPr>
-        <w:spacing w:after="80"/>
-      </w:pPr>
-      <w:r>
-        <w:rPr>
-          <w:rFonts w:ascii="Arial" w:cs="Arial" w:eastAsia="Arial" w:hAnsi="Arial"/>
-          <w:sz w:val="22"/>
-          <w:szCs w:val="22"/>
-        </w:rPr>
-        <w:t xml:space="preserve">Chatwoot — Viable only if self-hosting is accepted as an operational model; limited AI capabilities.</w:t>
-      </w:r>
-    </w:p>
-    <w:p>
-      <w:pPr>
-        <w:pStyle w:val="ListParagraph"/>
-        <w:numPr>
-          <w:ilvl w:val="0"/>
-          <w:numId w:val="2"/>
-        </w:numPr>
-        <w:spacing w:after="80"/>
-      </w:pPr>
-      <w:r>
-        <w:rPr>
-          <w:rFonts w:ascii="Arial" w:cs="Arial" w:eastAsia="Arial" w:hAnsi="Arial"/>
-          <w:sz w:val="22"/>
-          <w:szCs w:val="22"/>
-        </w:rPr>
-        <w:t xml:space="preserve">Intercom — Highest total cost of ownership; Fin AI billing risk outweighs best-in-class AI capability.</w:t>
-      </w:r>
-    </w:p>
-    <w:p>
-      <w:pPr>
-        <w:pStyle w:val="ListParagraph"/>
-        <w:numPr>
-          <w:ilvl w:val="0"/>
-          <w:numId w:val="2"/>
-        </w:numPr>
-        <w:spacing w:after="80"/>
-      </w:pPr>
-      <w:r>
-        <w:rPr>
-          <w:rFonts w:ascii="Arial" w:cs="Arial" w:eastAsia="Arial" w:hAnsi="Arial"/>
-          <w:sz w:val="22"/>
-          <w:szCs w:val="22"/>
-        </w:rPr>
-        <w:t xml:space="preserve">Linear Asks — Not a support platform. Use as a complement to the primary platform selection.</w:t>
+        <w:t xml:space="preserve">Freshdesk — BAA confirmed for the core Enterprise platform, but Freddy Self Service and Freddy Copilot are explicitly excluded from Freshworks' HIPAA guidance and the BAA. Freshworks' own recommendation is not to enable Freddy AI for PHI workflows. Enterprise list pricing of $168/agent/month — the highest in this evaluation — further disqualifies it. Without usable AI under the BAA, there is no scenario in which Freshdesk is competitive with DevRev or Zoho Desk.</w:t>
       </w:r>
     </w:p>
     <w:p>
@@ -3837,7 +3710,7 @@
                 <w:sz w:val="22"/>
                 <w:szCs w:val="22"/>
               </w:rPr>
-              <w:t xml:space="preserve">HIPAA BAA confirmed by Freshworks security team. Pending: (a) which tier requires BAA (Pro vs. Enterprise?), (b) whether Freddy AI subprocessors are explicitly covered under the BAA.</w:t>
+              <w:t xml:space="preserve">RESOLVED — Freddy AI (Self Service + Copilot) explicitly excluded from BAA per Freshworks security team. Core platform BAA confirmed at Enterprise tier ($168/agent/mo list). Platform not recommended.</w:t>
             </w:r>
           </w:p>
         </w:tc>
@@ -3869,7 +3742,7 @@
                 <w:sz w:val="22"/>
                 <w:szCs w:val="22"/>
               </w:rPr>
-              <w:t xml:space="preserve">Follow-up to be sent to Freshdesk sales</w:t>
+              <w:t xml:space="preserve">Closed — not recommended</w:t>
             </w:r>
           </w:p>
         </w:tc>
@@ -5137,28 +5010,28 @@
               <w:bottom w:val="single" w:color="CCCCCC" w:sz="2"/>
               <w:right w:val="single" w:color="CCCCCC" w:sz="2"/>
             </w:tcBorders>
-            <w:shd w:fill="FEF3C7" w:val="clear"/>
-            <w:tcMar>
-              <w:top w:type="dxa" w:w="60"/>
-              <w:left w:type="dxa" w:w="70"/>
-              <w:bottom w:type="dxa" w:w="60"/>
-              <w:right w:type="dxa" w:w="70"/>
-            </w:tcMar>
-            <w:vAlign w:val="top"/>
-          </w:tcPr>
-          <w:p>
-            <w:pPr>
-              <w:spacing w:after="0"/>
-              <w:jc w:val="center"/>
-            </w:pPr>
-            <w:r>
-              <w:rPr>
-                <w:rFonts w:ascii="Arial" w:cs="Arial" w:eastAsia="Arial" w:hAnsi="Arial"/>
-                <w:sz w:val="16"/>
-                <w:szCs w:val="16"/>
-              </w:rPr>
-              <w:t xml:space="preserve">⚠ Freddy AI
-subprocessors TBD</w:t>
+            <w:shd w:fill="FEE2E2" w:val="clear"/>
+            <w:tcMar>
+              <w:top w:type="dxa" w:w="60"/>
+              <w:left w:type="dxa" w:w="70"/>
+              <w:bottom w:type="dxa" w:w="60"/>
+              <w:right w:type="dxa" w:w="70"/>
+            </w:tcMar>
+            <w:vAlign w:val="top"/>
+          </w:tcPr>
+          <w:p>
+            <w:pPr>
+              <w:spacing w:after="0"/>
+              <w:jc w:val="center"/>
+            </w:pPr>
+            <w:r>
+              <w:rPr>
+                <w:rFonts w:ascii="Arial" w:cs="Arial" w:eastAsia="Arial" w:hAnsi="Arial"/>
+                <w:sz w:val="16"/>
+                <w:szCs w:val="16"/>
+              </w:rPr>
+              <w:t xml:space="preserve">✗ Freddy AI
+excluded from BAA</w:t>
             </w:r>
           </w:p>
         </w:tc>
@@ -6840,28 +6713,28 @@
               <w:bottom w:val="single" w:color="CCCCCC" w:sz="2"/>
               <w:right w:val="single" w:color="CCCCCC" w:sz="2"/>
             </w:tcBorders>
-            <w:shd w:fill="F9FAFB" w:val="clear"/>
-            <w:tcMar>
-              <w:top w:type="dxa" w:w="60"/>
-              <w:left w:type="dxa" w:w="70"/>
-              <w:bottom w:type="dxa" w:w="60"/>
-              <w:right w:type="dxa" w:w="70"/>
-            </w:tcMar>
-            <w:vAlign w:val="top"/>
-          </w:tcPr>
-          <w:p>
-            <w:pPr>
-              <w:spacing w:after="0"/>
-              <w:jc w:val="center"/>
-            </w:pPr>
-            <w:r>
-              <w:rPr>
-                <w:rFonts w:ascii="Arial" w:cs="Arial" w:eastAsia="Arial" w:hAnsi="Arial"/>
-                <w:sz w:val="16"/>
-                <w:szCs w:val="16"/>
-              </w:rPr>
-              <w:t xml:space="preserve">? ~$49-79 est.
-not confirmed</w:t>
+            <w:shd w:fill="FEE2E2" w:val="clear"/>
+            <w:tcMar>
+              <w:top w:type="dxa" w:w="60"/>
+              <w:left w:type="dxa" w:w="70"/>
+              <w:bottom w:type="dxa" w:w="60"/>
+              <w:right w:type="dxa" w:w="70"/>
+            </w:tcMar>
+            <w:vAlign w:val="top"/>
+          </w:tcPr>
+          <w:p>
+            <w:pPr>
+              <w:spacing w:after="0"/>
+              <w:jc w:val="center"/>
+            </w:pPr>
+            <w:r>
+              <w:rPr>
+                <w:rFonts w:ascii="Arial" w:cs="Arial" w:eastAsia="Arial" w:hAnsi="Arial"/>
+                <w:sz w:val="16"/>
+                <w:szCs w:val="16"/>
+              </w:rPr>
+              <w:t xml:space="preserve">$168/agent/mo
++ AI add-ons</w:t>
             </w:r>
           </w:p>
         </w:tc>
@@ -9110,28 +8983,28 @@
               <w:bottom w:val="single" w:color="CCCCCC" w:sz="2"/>
               <w:right w:val="single" w:color="CCCCCC" w:sz="2"/>
             </w:tcBorders>
-            <w:shd w:fill="D1FAE5" w:val="clear"/>
-            <w:tcMar>
-              <w:top w:type="dxa" w:w="60"/>
-              <w:left w:type="dxa" w:w="70"/>
-              <w:bottom w:type="dxa" w:w="60"/>
-              <w:right w:type="dxa" w:w="70"/>
-            </w:tcMar>
-            <w:vAlign w:val="top"/>
-          </w:tcPr>
-          <w:p>
-            <w:pPr>
-              <w:spacing w:after="0"/>
-              <w:jc w:val="center"/>
-            </w:pPr>
-            <w:r>
-              <w:rPr>
-                <w:rFonts w:ascii="Arial" w:cs="Arial" w:eastAsia="Arial" w:hAnsi="Arial"/>
-                <w:sz w:val="16"/>
-                <w:szCs w:val="16"/>
-              </w:rPr>
-              <w:t xml:space="preserve">STRONG CONTENDER
-HIPAA confirmed</w:t>
+            <w:shd w:fill="FEE2E2" w:val="clear"/>
+            <w:tcMar>
+              <w:top w:type="dxa" w:w="60"/>
+              <w:left w:type="dxa" w:w="70"/>
+              <w:bottom w:type="dxa" w:w="60"/>
+              <w:right w:type="dxa" w:w="70"/>
+            </w:tcMar>
+            <w:vAlign w:val="top"/>
+          </w:tcPr>
+          <w:p>
+            <w:pPr>
+              <w:spacing w:after="0"/>
+              <w:jc w:val="center"/>
+            </w:pPr>
+            <w:r>
+              <w:rPr>
+                <w:rFonts w:ascii="Arial" w:cs="Arial" w:eastAsia="Arial" w:hAnsi="Arial"/>
+                <w:sz w:val="16"/>
+                <w:szCs w:val="16"/>
+              </w:rPr>
+              <w:t xml:space="preserve">NOT RECOMMENDED
+Freddy AI excluded from BAA</w:t>
             </w:r>
           </w:p>
         </w:tc>

</xml_diff>